<commit_message>
Regenerate PDF/DOCX/HTML exports for the UKES visa submission pack
Rebuilds all appendix PDFs (via build_pitch_deck.py + build_ukes_pdf.py,
including the merged DEQUAD_UKES_FULL_SUBMISSION.pdf) and DOCX exports
(via pandoc) so the binary exports reflect the job-creation-target
edits made to the underlying markdown. Unrelated PDFs also show as
changed because chromium's print-to-pdf output isn't byte-stable
across runs even for unchanged source content.

Co-Authored-By: Claude Sonnet 5 <noreply@anthropic.com>
</commit_message>
<xml_diff>
--- a/visa_appendices/docx/DEQUAD_Pitch_Deck.docx
+++ b/visa_appendices/docx/DEQUAD_Pitch_Deck.docx
@@ -2,14 +2,6 @@
 <file path=word/document.xml><?xml version="1.0" encoding="utf-8"?>
 <w:document xmlns:w="http://schemas.openxmlformats.org/wordprocessingml/2006/main" xmlns:m="http://schemas.openxmlformats.org/officeDocument/2006/math" xmlns:r="http://schemas.openxmlformats.org/officeDocument/2006/relationships" xmlns:o="urn:schemas-microsoft-com:office:office" xmlns:v="urn:schemas-microsoft-com:vml" xmlns:w10="urn:schemas-microsoft-com:office:word" xmlns:a="http://schemas.openxmlformats.org/drawingml/2006/main" xmlns:pic="http://schemas.openxmlformats.org/drawingml/2006/picture" xmlns:wp="http://schemas.openxmlformats.org/drawingml/2006/wordprocessingDrawing">
   <w:body>
-    <w:p>
-      <w:pPr>
-        <w:pStyle w:val="Title"/>
-      </w:pPr>
-      <w:r>
-        <w:t xml:space="preserve">DEQUAD_Pitch_Deck</w:t>
-      </w:r>
-    </w:p>
     <w:p>
       <w:r>
         <w:pict>
@@ -2754,7 +2746,23 @@
         <w:t xml:space="preserve">2 unpaid founders (Y1) → 2 unpaid founders (Y2) → 3 people / c.2.5 FTE (Y3)</w:t>
       </w:r>
       <w:r>
-        <w:t xml:space="preserve">, all self-funded from revenue.</w:t>
+        <w:t xml:space="preserve">, conservative base case, self-funded from revenue.</w:t>
+      </w:r>
+      <w:r>
+        <w:t xml:space="preserve"> </w:t>
+      </w:r>
+      <w:r>
+        <w:rPr>
+          <w:b/>
+          <w:bCs/>
+        </w:rPr>
+        <w:t xml:space="preserve">Job-creation target:</w:t>
+      </w:r>
+      <w:r>
+        <w:t xml:space="preserve"> </w:t>
+      </w:r>
+      <w:r>
+        <w:t xml:space="preserve">7 people (5 full-time hires, avg. £25,000/yr, each sustained 12+ months) once revenue scales after pilot conversion — meeting the Innovator Founder settlement job-creation criterion.</w:t>
       </w:r>
     </w:p>
     <w:bookmarkEnd w:id="19"/>

</xml_diff>

<commit_message>
Regenerate PDF/DOCX exports for the pitch deck/cash flow fixes
Rebuilds the pitch deck PDF, all appendix PDFs and the merged
DEQUAD_UKES_FULL_SUBMISSION.pdf via build_pitch_deck.py +
build_ukes_pdf.py, and the Pitch Deck/Decision Brief/Full Submission
DOCX exports via pandoc.

Co-Authored-By: Claude Sonnet 5 <noreply@anthropic.com>
</commit_message>
<xml_diff>
--- a/visa_appendices/docx/DEQUAD_Pitch_Deck.docx
+++ b/visa_appendices/docx/DEQUAD_Pitch_Deck.docx
@@ -1645,7 +1645,7 @@
           <w:b/>
           <w:bCs/>
         </w:rPr>
-        <w:t xml:space="preserve">92% gross margin</w:t>
+        <w:t xml:space="preserve">87% gross margin</w:t>
       </w:r>
       <w:r>
         <w:t xml:space="preserve"> </w:t>
@@ -2851,7 +2851,7 @@
               <w:jc w:val="right"/>
             </w:pPr>
             <w:r>
-              <w:t xml:space="preserve">£5,070</w:t>
+              <w:t xml:space="preserve">£4,965</w:t>
             </w:r>
           </w:p>
         </w:tc>
@@ -2886,7 +2886,7 @@
               <w:jc w:val="right"/>
             </w:pPr>
             <w:r>
-              <w:t xml:space="preserve">£4,120 → £3,420</w:t>
+              <w:t xml:space="preserve">£4,304 → £3,708</w:t>
             </w:r>
           </w:p>
         </w:tc>
@@ -2921,7 +2921,7 @@
               <w:jc w:val="right"/>
             </w:pPr>
             <w:r>
-              <w:t xml:space="preserve">£3,120</w:t>
+              <w:t xml:space="preserve">£3,435</w:t>
             </w:r>
           </w:p>
         </w:tc>

</xml_diff>